<commit_message>
Complete Habrit Khadasha Structure
EH'YEH ASHER EH'YEH
</commit_message>
<xml_diff>
--- a/01 Tanakh/19 Yonah/Yonah 01.docx
+++ b/01 Tanakh/19 Yonah/Yonah 01.docx
@@ -485,56 +485,253 @@
   <w:p>
     <w:pPr>
       <w:spacing w:line="276" w:lineRule="auto"/>
+      <w:ind w:left="720" w:firstLine="0"/>
       <w:jc w:val="center"/>
-      <w:rPr/>
-    </w:pPr>
-    <w:r>
       <w:rPr>
         <w:sz w:val="18"/>
         <w:szCs w:val="18"/>
+      </w:rPr>
+    </w:pPr>
+    <w:r>
+      <w:rPr>
+        <w:sz w:val="20"/>
+        <w:szCs w:val="20"/>
+        <w:rtl w:val="1"/>
+      </w:rPr>
+      <w:t xml:space="preserve">א</w:t>
+    </w:r>
+    <w:r>
+      <w:rPr>
+        <w:sz w:val="20"/>
+        <w:szCs w:val="20"/>
+        <w:rtl w:val="1"/>
+      </w:rPr>
+      <w:t xml:space="preserve">ֲ</w:t>
+    </w:r>
+    <w:r>
+      <w:rPr>
+        <w:sz w:val="20"/>
+        <w:szCs w:val="20"/>
+        <w:rtl w:val="1"/>
+      </w:rPr>
+      <w:t xml:space="preserve">נ</w:t>
+    </w:r>
+    <w:r>
+      <w:rPr>
+        <w:sz w:val="20"/>
+        <w:szCs w:val="20"/>
+        <w:rtl w:val="1"/>
+      </w:rPr>
+      <w:t xml:space="preserve">ִ</w:t>
+    </w:r>
+    <w:r>
+      <w:rPr>
+        <w:sz w:val="20"/>
+        <w:szCs w:val="20"/>
+        <w:rtl w:val="1"/>
+      </w:rPr>
+      <w:t xml:space="preserve">י</w:t>
+    </w:r>
+    <w:r>
+      <w:rPr>
+        <w:sz w:val="20"/>
+        <w:szCs w:val="20"/>
+        <w:rtl w:val="1"/>
+      </w:rPr>
+      <w:t xml:space="preserve"> </w:t>
+    </w:r>
+    <w:r>
+      <w:rPr>
+        <w:sz w:val="20"/>
+        <w:szCs w:val="20"/>
+        <w:rtl w:val="1"/>
+      </w:rPr>
+      <w:t xml:space="preserve">ה</w:t>
+    </w:r>
+    <w:r>
+      <w:rPr>
+        <w:sz w:val="20"/>
+        <w:szCs w:val="20"/>
+        <w:rtl w:val="1"/>
+      </w:rPr>
+      <w:t xml:space="preserve">ָ</w:t>
+    </w:r>
+    <w:r>
+      <w:rPr>
+        <w:sz w:val="20"/>
+        <w:szCs w:val="20"/>
+        <w:rtl w:val="1"/>
+      </w:rPr>
+      <w:t xml:space="preserve">א</w:t>
+    </w:r>
+    <w:r>
+      <w:rPr>
+        <w:sz w:val="20"/>
+        <w:szCs w:val="20"/>
+        <w:rtl w:val="1"/>
+      </w:rPr>
+      <w:t xml:space="preserve">ָ</w:t>
+    </w:r>
+    <w:r>
+      <w:rPr>
+        <w:sz w:val="20"/>
+        <w:szCs w:val="20"/>
+        <w:rtl w:val="1"/>
+      </w:rPr>
+      <w:t xml:space="preserve">ל</w:t>
+    </w:r>
+    <w:r>
+      <w:rPr>
+        <w:sz w:val="20"/>
+        <w:szCs w:val="20"/>
+        <w:rtl w:val="1"/>
+      </w:rPr>
+      <w:t xml:space="preserve">ֶ</w:t>
+    </w:r>
+    <w:r>
+      <w:rPr>
+        <w:sz w:val="20"/>
+        <w:szCs w:val="20"/>
+        <w:rtl w:val="1"/>
+      </w:rPr>
+      <w:t xml:space="preserve">ף</w:t>
+    </w:r>
+    <w:r>
+      <w:rPr>
+        <w:sz w:val="20"/>
+        <w:szCs w:val="20"/>
+        <w:rtl w:val="1"/>
+      </w:rPr>
+      <w:t xml:space="preserve"> </w:t>
+    </w:r>
+    <w:r>
+      <w:rPr>
+        <w:sz w:val="20"/>
+        <w:szCs w:val="20"/>
+        <w:rtl w:val="1"/>
+      </w:rPr>
+      <w:t xml:space="preserve">א</w:t>
+    </w:r>
+    <w:r>
+      <w:rPr>
+        <w:sz w:val="20"/>
+        <w:szCs w:val="20"/>
+        <w:rtl w:val="1"/>
+      </w:rPr>
+      <w:t xml:space="preserve">ַ</w:t>
+    </w:r>
+    <w:r>
+      <w:rPr>
+        <w:sz w:val="20"/>
+        <w:szCs w:val="20"/>
+        <w:rtl w:val="1"/>
+      </w:rPr>
+      <w:t xml:space="preserve">ף</w:t>
+    </w:r>
+    <w:r>
+      <w:rPr>
+        <w:sz w:val="20"/>
+        <w:szCs w:val="20"/>
+        <w:rtl w:val="1"/>
+      </w:rPr>
+      <w:t xml:space="preserve"> </w:t>
+    </w:r>
+    <w:r>
+      <w:rPr>
+        <w:sz w:val="20"/>
+        <w:szCs w:val="20"/>
+        <w:rtl w:val="1"/>
+      </w:rPr>
+      <w:t xml:space="preserve">א</w:t>
+    </w:r>
+    <w:r>
+      <w:rPr>
+        <w:sz w:val="20"/>
+        <w:szCs w:val="20"/>
+        <w:rtl w:val="1"/>
+      </w:rPr>
+      <w:t xml:space="preserve">ֲ</w:t>
+    </w:r>
+    <w:r>
+      <w:rPr>
+        <w:sz w:val="20"/>
+        <w:szCs w:val="20"/>
+        <w:rtl w:val="1"/>
+      </w:rPr>
+      <w:t xml:space="preserve">נ</w:t>
+    </w:r>
+    <w:r>
+      <w:rPr>
+        <w:sz w:val="20"/>
+        <w:szCs w:val="20"/>
+        <w:rtl w:val="1"/>
+      </w:rPr>
+      <w:t xml:space="preserve">ִ</w:t>
+    </w:r>
+    <w:r>
+      <w:rPr>
+        <w:sz w:val="20"/>
+        <w:szCs w:val="20"/>
+        <w:rtl w:val="1"/>
+      </w:rPr>
+      <w:t xml:space="preserve">י</w:t>
+    </w:r>
+    <w:r>
+      <w:rPr>
+        <w:sz w:val="20"/>
+        <w:szCs w:val="20"/>
+        <w:rtl w:val="1"/>
+      </w:rPr>
+      <w:t xml:space="preserve"> </w:t>
+    </w:r>
+    <w:r>
+      <w:rPr>
+        <w:sz w:val="20"/>
+        <w:szCs w:val="20"/>
+        <w:rtl w:val="1"/>
+      </w:rPr>
+      <w:t xml:space="preserve">ה</w:t>
+    </w:r>
+    <w:r>
+      <w:rPr>
+        <w:sz w:val="20"/>
+        <w:szCs w:val="20"/>
+        <w:rtl w:val="1"/>
+      </w:rPr>
+      <w:t xml:space="preserve">ַ</w:t>
+    </w:r>
+    <w:r>
+      <w:rPr>
+        <w:sz w:val="20"/>
+        <w:szCs w:val="20"/>
+        <w:rtl w:val="1"/>
+      </w:rPr>
+      <w:t xml:space="preserve">ת</w:t>
+    </w:r>
+    <w:r>
+      <w:rPr>
+        <w:sz w:val="20"/>
+        <w:szCs w:val="20"/>
+        <w:rtl w:val="1"/>
+      </w:rPr>
+      <w:t xml:space="preserve">ָּ</w:t>
+    </w:r>
+    <w:r>
+      <w:rPr>
+        <w:sz w:val="20"/>
+        <w:szCs w:val="20"/>
+        <w:rtl w:val="1"/>
+      </w:rPr>
+      <w:t xml:space="preserve">ו</w:t>
+    </w:r>
+    <w:r>
+      <w:rPr>
+        <w:sz w:val="20"/>
+        <w:szCs w:val="20"/>
         <w:rtl w:val="0"/>
       </w:rPr>
-      <w:t xml:space="preserve">Modded from: The TLV Bible / </w:t>
-    </w:r>
-    <w:r>
-      <w:rPr>
-        <w:sz w:val="20"/>
-        <w:szCs w:val="20"/>
-        <w:rtl w:val="1"/>
-      </w:rPr>
-      <w:t xml:space="preserve">תנ</w:t>
-    </w:r>
-    <w:r>
-      <w:rPr>
-        <w:sz w:val="20"/>
-        <w:szCs w:val="20"/>
-        <w:rtl w:val="1"/>
-      </w:rPr>
-      <w:t xml:space="preserve">"</w:t>
-    </w:r>
-    <w:r>
-      <w:rPr>
-        <w:sz w:val="20"/>
-        <w:szCs w:val="20"/>
-        <w:rtl w:val="1"/>
-      </w:rPr>
-      <w:t xml:space="preserve">ך</w:t>
-    </w:r>
-    <w:r>
-      <w:rPr>
-        <w:sz w:val="20"/>
-        <w:szCs w:val="20"/>
-        <w:rtl w:val="1"/>
-      </w:rPr>
-      <w:t xml:space="preserve"> </w:t>
-    </w:r>
-    <w:r>
-      <w:rPr>
-        <w:sz w:val="20"/>
-        <w:szCs w:val="20"/>
-        <w:rtl w:val="1"/>
-      </w:rPr>
-      <w:t xml:space="preserve">ומודרני</w:t>
+      <w:t xml:space="preserve">         </w:t>
+      <w:tab/>
     </w:r>
     <w:r>
       <w:rPr>
@@ -552,8 +749,8 @@
       <w:bidi w:val="1"/>
       <w:spacing w:line="276" w:lineRule="auto"/>
       <w:rPr>
-        <w:sz w:val="28"/>
-        <w:szCs w:val="28"/>
+        <w:sz w:val="26"/>
+        <w:szCs w:val="26"/>
       </w:rPr>
     </w:pPr>
     <w:r>
@@ -610,13 +807,13 @@
       <w:tab/>
       <w:t xml:space="preserve">   </w:t>
       <w:tab/>
-      <w:t xml:space="preserve">                  </w:t>
+      <w:t xml:space="preserve">             </w:t>
     </w:r>
     <w:r>
       <w:rPr>
         <w:rtl w:val="0"/>
       </w:rPr>
-      <w:t xml:space="preserve">The Elohim Bible</w:t>
+      <w:t xml:space="preserve">The EH'YEH Seisho</w:t>
     </w:r>
     <w:r>
       <w:rPr>

</xml_diff>